<commit_message>
minor modifications and pdf generation of application files
</commit_message>
<xml_diff>
--- a/Letter of Motivation.docx
+++ b/Letter of Motivation.docx
@@ -506,8 +506,6 @@
         </w:rPr>
         <w:t>consideration</w:t>
       </w:r>
-      <w:bookmarkStart w:id="0" w:name="_GoBack"/>
-      <w:bookmarkEnd w:id="0"/>
       <w:r>
         <w:rPr>
           <w:rFonts w:ascii="Calibri" w:hAnsi="Calibri" w:cs="Calibri"/>
@@ -807,15 +805,17 @@
           <w:sz w:val="24"/>
           <w:szCs w:val="24"/>
         </w:rPr>
-        <w:t xml:space="preserve"> </w:t>
-      </w:r>
-      <w:r>
-        <w:rPr>
-          <w:rFonts w:ascii="Calibri" w:hAnsi="Calibri" w:cs="Calibri"/>
-          <w:sz w:val="24"/>
-          <w:szCs w:val="24"/>
-        </w:rPr>
-        <w:t xml:space="preserve">And, </w:t>
+        <w:t>Moreover</w:t>
+      </w:r>
+      <w:bookmarkStart w:id="0" w:name="_GoBack"/>
+      <w:bookmarkEnd w:id="0"/>
+      <w:r>
+        <w:rPr>
+          <w:rFonts w:ascii="Calibri" w:hAnsi="Calibri" w:cs="Calibri"/>
+          <w:sz w:val="24"/>
+          <w:szCs w:val="24"/>
+        </w:rPr>
+        <w:t xml:space="preserve">, </w:t>
       </w:r>
       <w:r>
         <w:rPr>
@@ -856,15 +856,7 @@
           <w:sz w:val="24"/>
           <w:szCs w:val="24"/>
         </w:rPr>
-        <w:t>art</w:t>
-      </w:r>
-      <w:r>
-        <w:rPr>
-          <w:rFonts w:ascii="Calibri" w:hAnsi="Calibri" w:cs="Calibri"/>
-          <w:sz w:val="24"/>
-          <w:szCs w:val="24"/>
-        </w:rPr>
-        <w:t xml:space="preserve">, </w:t>
+        <w:t xml:space="preserve">art, </w:t>
       </w:r>
       <w:r>
         <w:rPr>

</xml_diff>